<commit_message>
finished 411 hw 1
</commit_message>
<xml_diff>
--- a/cs411/cs411_homework_1.docx
+++ b/cs411/cs411_homework_1.docx
@@ -109,6 +109,108 @@
           <w:numId w:val="1"/>
         </w:numPr>
       </w:pPr>
+      <w:r>
+        <w:t>Performance Measure: The soccer-playing robot is measured in how well it is able to both score goals and prevent the opposing team from scoring goals. It is also measured in its efficiency when doing this. Scoring more goals than goals allowed is preferred.</w:t>
+      </w:r>
+    </w:p>
+    <w:p>
+      <w:pPr>
+        <w:pStyle w:val="ListParagraph"/>
+      </w:pPr>
+    </w:p>
+    <w:p>
+      <w:pPr>
+        <w:pStyle w:val="ListParagraph"/>
+      </w:pPr>
+      <w:r>
+        <w:t xml:space="preserve">Environment: The environment consists of the soccer field itself, the ball, the two goals, any potential referees, and anyone playing in the match. This includes the </w:t>
+      </w:r>
+      <w:r>
+        <w:lastRenderedPageBreak/>
+        <w:t>soccer-playing robot itself, any other soccer-playing robots participating, and any potential human players that are participating.</w:t>
+      </w:r>
+    </w:p>
+    <w:p>
+      <w:pPr>
+        <w:pStyle w:val="ListParagraph"/>
+      </w:pPr>
+    </w:p>
+    <w:p>
+      <w:pPr>
+        <w:pStyle w:val="ListParagraph"/>
+      </w:pPr>
+      <w:r>
+        <w:t>Actuators:</w:t>
+      </w:r>
+      <w:r>
+        <w:t xml:space="preserve"> The soccer-playing robot’s actuators consist of a set of robotic legs, torso, and head with the purpose of hitting the ball in a way that maximizes its performance measure. If the soccer-playing robot is also configured with the ability to play goalie, then it will also come with a set of robotic arms as well.</w:t>
+      </w:r>
+    </w:p>
+    <w:p>
+      <w:pPr>
+        <w:pStyle w:val="ListParagraph"/>
+      </w:pPr>
+    </w:p>
+    <w:p>
+      <w:pPr>
+        <w:pStyle w:val="ListParagraph"/>
+      </w:pPr>
+      <w:r>
+        <w:t>Sensors: The soccer-playing robot will come equipped with a GPS, accelerometer, and a set of cameras to determine its position on the field, the position of the ball and other players, and how fast they are moving.</w:t>
+      </w:r>
+    </w:p>
+    <w:p>
+      <w:pPr>
+        <w:pStyle w:val="ListParagraph"/>
+      </w:pPr>
+    </w:p>
+    <w:p>
+      <w:pPr>
+        <w:pStyle w:val="ListParagraph"/>
+        <w:numPr>
+          <w:ilvl w:val="0"/>
+          <w:numId w:val="1"/>
+        </w:numPr>
+      </w:pPr>
+      <w:r>
+        <w:t>A rational agent is an agent that acts in such a way that it maximizes its performance measure. A rational agent will choose whichever action maximizes the expected value of its performance measure given the percepts it has received. Using the part-picking robot as an example,</w:t>
+      </w:r>
+      <w:r>
+        <w:t xml:space="preserve"> the part-picking robot will choose to sort each part into the correct bin because that would maximize its performance measure. An autonomous agent uses its prior percepts to make decisions based on its agent function. The part-picking robot is able to autonomously perceive which part is next on the conveyer belt and is able to sort it accordingly. When the next part arrives, the part-picking robot does not require human intervention to continue sorting.</w:t>
+      </w:r>
+    </w:p>
+    <w:p>
+      <w:pPr>
+        <w:pStyle w:val="ListParagraph"/>
+      </w:pPr>
+    </w:p>
+    <w:p>
+      <w:pPr>
+        <w:pStyle w:val="ListParagraph"/>
+        <w:numPr>
+          <w:ilvl w:val="0"/>
+          <w:numId w:val="1"/>
+        </w:numPr>
+      </w:pPr>
+      <w:r>
+        <w:t>A) It is not possible to add an option for NoOp that allows for the vacuum cleaner to stop moving. For NoOp to be desirable, both the left and right rooms would have to be clean. This means that for NoOp to be selected, the vacuum cleaner would have to remember the status of the room it was in previously. However, since the vacuum cleaner is a simple reflex agent, it does not remember its prior percepts and acts only according to the most recent percept it receives. Because of this, it is not possible to add an option for NoOp when both rooms are clean.</w:t>
+      </w:r>
+    </w:p>
+    <w:p>
+      <w:pPr>
+        <w:pStyle w:val="ListParagraph"/>
+      </w:pPr>
+    </w:p>
+    <w:p>
+      <w:pPr>
+        <w:pStyle w:val="ListParagraph"/>
+      </w:pPr>
+      <w:r>
+        <w:t>B) A model-based reflex agent would allow for the vacuum cleaner to stop moving after both the left and right rooms are clean. Model-based reflex agents allow for the agent to maintain an internal state that keeps track of the state of the environment based on the prior percepts it receives. A model-based reflex agent for the vacuum cleaner could be programmed such that if it has just cleaned the right room and its prior percept</w:t>
+      </w:r>
+      <w:r>
+        <w:t>s indicate that it has also cleaned the left room, then it can stop moving.</w:t>
+      </w:r>
     </w:p>
     <w:sectPr>
       <w:pgSz w:w="12240" w:h="15840"/>

</xml_diff>